<commit_message>
added retry for a topic with interval if failed then send it to the dlq topic which will save failed order into db for later to try to process with a scheduler
</commit_message>
<xml_diff>
--- a/Exercizes.docx
+++ b/Exercizes.docx
@@ -7306,28 +7306,14 @@
       </w:r>
     </w:p>
     <w:p>
-      <w:pPr>
-        <w:rPr>
-          <w:lang w:val="es-MX"/>
-        </w:rPr>
-      </w:pPr>
-      <w:r>
-        <w:tab/>
-      </w:r>
-      <w:r>
-        <w:rPr>
-          <w:lang w:val="es-MX"/>
-        </w:rPr>
+      <w:r>
+        <w:tab/>
+      </w:r>
+      <w:r>
         <w:t>agregarSaludo(saludo:string){ signalname.set(saludo)}</w:t>
       </w:r>
     </w:p>
-    <w:p>
-      <w:pPr>
-        <w:rPr>
-          <w:lang w:val="es-MX"/>
-        </w:rPr>
-      </w:pPr>
-    </w:p>
+    <w:p/>
     <w:p>
       <w:r>
         <w:t>-send the key pressed in a input and alert its value</w:t>
@@ -10113,13 +10099,7 @@
         <w:pStyle w:val="ListParagraph"/>
       </w:pPr>
       <w:r>
-        <w:t xml:space="preserve">Add </w:t>
-      </w:r>
-      <w:r>
-        <w:t>prefer-ip-address: true</w:t>
-      </w:r>
-      <w:r>
-        <w:t xml:space="preserve"> in the eureka properties to all ms</w:t>
+        <w:t>Add prefer-ip-address: true in the eureka properties to all ms</w:t>
       </w:r>
     </w:p>
     <w:p/>
@@ -10145,6 +10125,9 @@
     </w:p>
     <w:p>
       <w:r>
+        <w:rPr>
+          <w:noProof/>
+        </w:rPr>
         <w:drawing>
           <wp:inline distT="0" distB="0" distL="0" distR="0" wp14:anchorId="02B3FBDA" wp14:editId="23E7D055">
             <wp:extent cx="5943600" cy="1153795"/>
@@ -10189,6 +10172,9 @@
     </w:p>
     <w:p>
       <w:r>
+        <w:rPr>
+          <w:noProof/>
+        </w:rPr>
         <w:drawing>
           <wp:inline distT="0" distB="0" distL="0" distR="0" wp14:anchorId="235F7A58" wp14:editId="6629F7A5">
             <wp:extent cx="5943600" cy="793750"/>
@@ -10234,6 +10220,276 @@
         <w:t>, add the service to the gateway configured routes and be sure it is registered with eureka client.</w:t>
       </w:r>
     </w:p>
+    <w:p/>
+    <w:p>
+      <w:pPr>
+        <w:pStyle w:val="ListParagraph"/>
+        <w:numPr>
+          <w:ilvl w:val="0"/>
+          <w:numId w:val="4"/>
+        </w:numPr>
+      </w:pPr>
+      <w:r>
+        <w:t>Circuit breaker</w:t>
+      </w:r>
+    </w:p>
+    <w:p>
+      <w:r>
+        <w:tab/>
+        <w:t xml:space="preserve">Added the </w:t>
+      </w:r>
+      <w:r>
+        <w:t xml:space="preserve">circuit breaker </w:t>
+      </w:r>
+      <w:r>
+        <w:t>dependency</w:t>
+      </w:r>
+      <w:r>
+        <w:t>, it also must have aop dependency because circuit breaker works with aop</w:t>
+      </w:r>
+      <w:r>
+        <w:t>, added circuit properties,</w:t>
+      </w:r>
+      <w:r>
+        <w:t xml:space="preserve"> annotate a method with @CircuitBreaker name=</w:t>
+      </w:r>
+      <w:r>
+        <w:t xml:space="preserve">same as in property instances in yml. </w:t>
+      </w:r>
+      <w:r>
+        <w:t>And fallback method,</w:t>
+      </w:r>
+    </w:p>
+    <w:p>
+      <w:r>
+        <w:t xml:space="preserve">Fallback method should be in same class with same signatura but adding </w:t>
+      </w:r>
+      <w:r>
+        <w:t xml:space="preserve">parameter </w:t>
+      </w:r>
+      <w:r>
+        <w:t>Throwable ex</w:t>
+      </w:r>
+      <w:r>
+        <w:t>.</w:t>
+      </w:r>
+    </w:p>
+    <w:p>
+      <w:r>
+        <w:t>After each time the annotated circuit breaker method fails, it will trigger the fallback</w:t>
+      </w:r>
+      <w:r>
+        <w:t xml:space="preserve"> method. This example is calling another ms I confirmed that while the </w:t>
+      </w:r>
+      <w:r>
+        <w:t xml:space="preserve">state of the circuit is closed it was reaching the inventory ms, once it changed to opened the inventory ms was not triggering, once the </w:t>
+      </w:r>
+      <w:r>
+        <w:t>waitDurationInOpenState: 30s</w:t>
+      </w:r>
+      <w:r>
+        <w:t xml:space="preserve"> passed, it was now again triggering the inventory ms.</w:t>
+      </w:r>
+    </w:p>
+    <w:p>
+      <w:r>
+        <w:t>Open feign</w:t>
+      </w:r>
+      <w:r>
+        <w:t xml:space="preserve"> was configured in properties to have a connectTimeout for the testing of circuit breaker to work</w:t>
+      </w:r>
+    </w:p>
+    <w:p>
+      <w:r>
+        <w:lastRenderedPageBreak/>
+        <w:t xml:space="preserve">The annotated method with @CircuitBreaker was moved to another </w:t>
+      </w:r>
+      <w:r>
+        <w:t>@Service, it works with proxies, I was calling it from the same class so it wont work, unless it is called from outside. Also I had th</w:t>
+      </w:r>
+      <w:r>
+        <w:t>is class injected with @AllArgsCostructor but with the final identifier, so proxies wont work</w:t>
+      </w:r>
+      <w:r>
+        <w:t xml:space="preserve"> for final classes, I had to remove the final keyword for it</w:t>
+      </w:r>
+    </w:p>
+    <w:p>
+      <w:r>
+        <w:t>@EnabledAspectJAutoProxy as well in the application</w:t>
+      </w:r>
+    </w:p>
+    <w:p/>
+    <w:p>
+      <w:pPr>
+        <w:pStyle w:val="ListParagraph"/>
+        <w:numPr>
+          <w:ilvl w:val="0"/>
+          <w:numId w:val="4"/>
+        </w:numPr>
+      </w:pPr>
+      <w:r>
+        <w:t>Failed messages into db to retry later</w:t>
+      </w:r>
+    </w:p>
+    <w:p>
+      <w:pPr>
+        <w:ind w:firstLine="720"/>
+      </w:pPr>
+      <w:r>
+        <w:t xml:space="preserve">Added </w:t>
+      </w:r>
+      <w:r>
+        <w:t>dlq for the topic (</w:t>
+      </w:r>
+      <w:r>
+        <w:t>configured it to retry 3 times with a 2 seconds interval, if failed then the message will be send to the dlq topic</w:t>
+      </w:r>
+      <w:r>
+        <w:t xml:space="preserve">) then added a consumer function stream to listen on the dlq topic and it will insert the failed order into the db with some extra </w:t>
+      </w:r>
+      <w:r>
+        <w:t xml:space="preserve">properties like retries, to control how many times we want to retry to complete the message. Then added an scheduler, needs to enable scheduling, the scheduler is running each 30 seconds, retrieves data from the </w:t>
+      </w:r>
+      <w:r>
+        <w:t>db with the failed messages, using stream bridge send that message into the notificationTopic again so the inventory will re run it</w:t>
+      </w:r>
+      <w:r>
+        <w:t>, if success then it removes from db if not increase retry count to make sure it will not run in circles forever</w:t>
+      </w:r>
+      <w:r>
+        <w:t>.</w:t>
+      </w:r>
+    </w:p>
+    <w:p/>
+    <w:p>
+      <w:pPr>
+        <w:pStyle w:val="ListParagraph"/>
+        <w:numPr>
+          <w:ilvl w:val="0"/>
+          <w:numId w:val="4"/>
+        </w:numPr>
+      </w:pPr>
+      <w:r>
+        <w:t xml:space="preserve">Failed messages into </w:t>
+      </w:r>
+      <w:r>
+        <w:t>a topic-based retry pipeline</w:t>
+      </w:r>
+      <w:r>
+        <w:t xml:space="preserve">, </w:t>
+      </w:r>
+      <w:r>
+        <w:t>several topics</w:t>
+      </w:r>
+      <w:r>
+        <w:t xml:space="preserve"> to attempt after time</w:t>
+      </w:r>
+      <w:r>
+        <w:t xml:space="preserve"> instead of saving it into a database:</w:t>
+      </w:r>
+    </w:p>
+    <w:p>
+      <w:pPr>
+        <w:pStyle w:val="ListParagraph"/>
+      </w:pPr>
+      <w:r>
+        <w:t xml:space="preserve">notificationTopic </w:t>
+      </w:r>
+      <w:r>
+        <w:br/>
+        <w:t>↓</w:t>
+      </w:r>
+      <w:r>
+        <w:br/>
+        <w:t xml:space="preserve">retry-5s-topic </w:t>
+      </w:r>
+      <w:r>
+        <w:br/>
+        <w:t>↓</w:t>
+      </w:r>
+      <w:r>
+        <w:br/>
+        <w:t xml:space="preserve">retry-30s-topic </w:t>
+      </w:r>
+      <w:r>
+        <w:br/>
+        <w:t>↓</w:t>
+      </w:r>
+      <w:r>
+        <w:br/>
+        <w:t xml:space="preserve">retry-5min-topic </w:t>
+      </w:r>
+      <w:r>
+        <w:br/>
+        <w:t>↓</w:t>
+      </w:r>
+      <w:r>
+        <w:br/>
+        <w:t>DLQ (final)</w:t>
+      </w:r>
+      <w:r>
+        <w:t xml:space="preserve"> (no more </w:t>
+      </w:r>
+      <w:r>
+        <w:t>attemps for this topic)</w:t>
+      </w:r>
+    </w:p>
+    <w:p>
+      <w:pPr>
+        <w:pStyle w:val="ListParagraph"/>
+      </w:pPr>
+    </w:p>
+    <w:p>
+      <w:pPr>
+        <w:pStyle w:val="ListParagraph"/>
+      </w:pPr>
+      <w:r>
+        <w:lastRenderedPageBreak/>
+        <w:drawing>
+          <wp:inline distT="0" distB="0" distL="0" distR="0" wp14:anchorId="65001C50" wp14:editId="504B1BED">
+            <wp:extent cx="3781953" cy="3505689"/>
+            <wp:effectExtent l="0" t="0" r="9525" b="0"/>
+            <wp:docPr id="1793279059" name="Picture 1"/>
+            <wp:cNvGraphicFramePr>
+              <a:graphicFrameLocks xmlns:a="http://schemas.openxmlformats.org/drawingml/2006/main" noChangeAspect="1"/>
+            </wp:cNvGraphicFramePr>
+            <a:graphic xmlns:a="http://schemas.openxmlformats.org/drawingml/2006/main">
+              <a:graphicData uri="http://schemas.openxmlformats.org/drawingml/2006/picture">
+                <pic:pic xmlns:pic="http://schemas.openxmlformats.org/drawingml/2006/picture">
+                  <pic:nvPicPr>
+                    <pic:cNvPr id="1793279059" name=""/>
+                    <pic:cNvPicPr/>
+                  </pic:nvPicPr>
+                  <pic:blipFill>
+                    <a:blip r:embed="rId70"/>
+                    <a:stretch>
+                      <a:fillRect/>
+                    </a:stretch>
+                  </pic:blipFill>
+                  <pic:spPr>
+                    <a:xfrm>
+                      <a:off x="0" y="0"/>
+                      <a:ext cx="3781953" cy="3505689"/>
+                    </a:xfrm>
+                    <a:prstGeom prst="rect">
+                      <a:avLst/>
+                    </a:prstGeom>
+                  </pic:spPr>
+                </pic:pic>
+              </a:graphicData>
+            </a:graphic>
+          </wp:inline>
+        </w:drawing>
+      </w:r>
+    </w:p>
+    <w:p>
+      <w:pPr>
+        <w:pStyle w:val="ListParagraph"/>
+        <w:ind w:left="360"/>
+      </w:pPr>
+    </w:p>
+    <w:p/>
     <w:p/>
     <w:p>
       <w:r>

</xml_diff>

<commit_message>
added oauth and jwt authentication but adding a endpoint to login and get the jwt token which is later used in the requests, each ms have the logic to validate with the secret the signature of the jwt token to confirm is valid
</commit_message>
<xml_diff>
--- a/Exercizes.docx
+++ b/Exercizes.docx
@@ -10445,6 +10445,9 @@
         <w:pStyle w:val="ListParagraph"/>
       </w:pPr>
       <w:r>
+        <w:rPr>
+          <w:noProof/>
+        </w:rPr>
         <w:lastRenderedPageBreak/>
         <w:drawing>
           <wp:inline distT="0" distB="0" distL="0" distR="0" wp14:anchorId="65001C50" wp14:editId="504B1BED">
@@ -10489,14 +10492,347 @@
         <w:ind w:left="360"/>
       </w:pPr>
     </w:p>
+    <w:p>
+      <w:r>
+        <w:t>Implement dlq</w:t>
+      </w:r>
+      <w:r>
+        <w:t xml:space="preserve"> (</w:t>
+      </w:r>
+      <w:r>
+        <w:rPr>
+          <w:b/>
+          <w:bCs/>
+        </w:rPr>
+        <w:t>DLQ</w:t>
+      </w:r>
+      <w:r>
+        <w:t> (o </w:t>
+      </w:r>
+      <w:r>
+        <w:rPr>
+          <w:b/>
+          <w:bCs/>
+        </w:rPr>
+        <w:t>Dead Letter Topic - DLT</w:t>
+      </w:r>
+      <w:r>
+        <w:t> como se le llama en Spring Kafka</w:t>
+      </w:r>
+      <w:r>
+        <w:t>)</w:t>
+      </w:r>
+      <w:r>
+        <w:t xml:space="preserve"> but without kafka streams using </w:t>
+      </w:r>
+      <w:r>
+        <w:t xml:space="preserve">kafka listener and </w:t>
+      </w:r>
+      <w:r>
+        <w:rPr>
+          <w:b/>
+          <w:bCs/>
+        </w:rPr>
+        <w:t>@RetryableTopic</w:t>
+      </w:r>
+    </w:p>
+    <w:p>
+      <w:r>
+        <w:rPr>
+          <w:noProof/>
+        </w:rPr>
+        <w:drawing>
+          <wp:inline distT="0" distB="0" distL="0" distR="0" wp14:anchorId="44D9960A" wp14:editId="6A5DC87C">
+            <wp:extent cx="3515216" cy="1991003"/>
+            <wp:effectExtent l="0" t="0" r="9525" b="9525"/>
+            <wp:docPr id="1001188862" name="Picture 1"/>
+            <wp:cNvGraphicFramePr>
+              <a:graphicFrameLocks xmlns:a="http://schemas.openxmlformats.org/drawingml/2006/main" noChangeAspect="1"/>
+            </wp:cNvGraphicFramePr>
+            <a:graphic xmlns:a="http://schemas.openxmlformats.org/drawingml/2006/main">
+              <a:graphicData uri="http://schemas.openxmlformats.org/drawingml/2006/picture">
+                <pic:pic xmlns:pic="http://schemas.openxmlformats.org/drawingml/2006/picture">
+                  <pic:nvPicPr>
+                    <pic:cNvPr id="1001188862" name=""/>
+                    <pic:cNvPicPr/>
+                  </pic:nvPicPr>
+                  <pic:blipFill>
+                    <a:blip r:embed="rId71"/>
+                    <a:stretch>
+                      <a:fillRect/>
+                    </a:stretch>
+                  </pic:blipFill>
+                  <pic:spPr>
+                    <a:xfrm>
+                      <a:off x="0" y="0"/>
+                      <a:ext cx="3515216" cy="1991003"/>
+                    </a:xfrm>
+                    <a:prstGeom prst="rect">
+                      <a:avLst/>
+                    </a:prstGeom>
+                  </pic:spPr>
+                </pic:pic>
+              </a:graphicData>
+            </a:graphic>
+          </wp:inline>
+        </w:drawing>
+      </w:r>
+    </w:p>
     <w:p/>
+    <w:p>
+      <w:pPr>
+        <w:pStyle w:val="ListParagraph"/>
+        <w:numPr>
+          <w:ilvl w:val="0"/>
+          <w:numId w:val="4"/>
+        </w:numPr>
+      </w:pPr>
+      <w:r>
+        <w:t xml:space="preserve">Added validation to dlq to retry only retryable exceptions like timeouts </w:t>
+      </w:r>
+    </w:p>
+    <w:p>
+      <w:pPr>
+        <w:pStyle w:val="ListParagraph"/>
+        <w:ind w:left="360" w:firstLine="360"/>
+      </w:pPr>
+      <w:r>
+        <w:t xml:space="preserve">by adding a property, catch an exception in the </w:t>
+      </w:r>
+      <w:r>
+        <w:t xml:space="preserve">function processing and if it was timeout throw custom retryableexception which was configure to </w:t>
+      </w:r>
+      <w:r>
+        <w:t>do retry</w:t>
+      </w:r>
+    </w:p>
     <w:p/>
     <w:p>
+      <w:pPr>
+        <w:pStyle w:val="ListParagraph"/>
+        <w:numPr>
+          <w:ilvl w:val="0"/>
+          <w:numId w:val="4"/>
+        </w:numPr>
+      </w:pPr>
+      <w:r>
+        <w:t>Added retry to circuit breaker method</w:t>
+      </w:r>
+    </w:p>
+    <w:p>
+      <w:pPr>
+        <w:pStyle w:val="ListParagraph"/>
+      </w:pPr>
+      <w:r>
+        <w:lastRenderedPageBreak/>
+        <w:t>By adding @Retry(name=nameInPropertiesOfRetry) to the method annotated with @CircuitBreaker</w:t>
+      </w:r>
+      <w:r>
+        <w:t xml:space="preserve">.. ORDER MATTERS BECAUSE AOP, NEED TO BE @CIRCUITBREAKER THEN @RETRY BECAUSE IF IT IS INVERSED IT WILL GO DIRECTLY TO </w:t>
+      </w:r>
+      <w:r>
+        <w:t>CIRTUIT BREAKER FALLBACK WITHOUT RETRYING</w:t>
+      </w:r>
+      <w:r>
+        <w:t>.</w:t>
+      </w:r>
+    </w:p>
+    <w:p>
+      <w:pPr>
+        <w:pStyle w:val="ListParagraph"/>
+      </w:pPr>
+      <w:r>
+        <w:t xml:space="preserve">TO WORK FALLBACK SHOULD NOT BE CONFIGURED IN CIRCUIT BREAKER OTHERWISE IT WILL GO THERE WITHOUT RETRY, ADD APPART THE FALLBACK MANUALLY </w:t>
+      </w:r>
+      <w:r>
+        <w:t>AFTER RETRIES IN THE FLOW</w:t>
+      </w:r>
+    </w:p>
+    <w:p/>
+    <w:p>
+      <w:pPr>
+        <w:pStyle w:val="ListParagraph"/>
+        <w:numPr>
+          <w:ilvl w:val="0"/>
+          <w:numId w:val="4"/>
+        </w:numPr>
+      </w:pPr>
+      <w:r>
+        <w:t>Add Saga Pattern</w:t>
+      </w:r>
+    </w:p>
+    <w:p>
+      <w:pPr>
+        <w:pStyle w:val="ListParagraph"/>
+      </w:pPr>
+      <w:r>
+        <w:t xml:space="preserve">Added saga pattern between the orders and inventory ms, added a endpoint in orders for a saga pattern flow, this calls the service which </w:t>
+      </w:r>
+      <w:r>
+        <w:t xml:space="preserve">gets the orderdto and sends it using streambridge to the </w:t>
+      </w:r>
+      <w:r>
+        <w:t>inventoryTopic</w:t>
+      </w:r>
+      <w:r>
+        <w:t>, created a</w:t>
+      </w:r>
+      <w:r>
+        <w:t xml:space="preserve"> stream function in inventory so it will listen to </w:t>
+      </w:r>
+      <w:r>
+        <w:t>inventoryTopic</w:t>
+      </w:r>
+      <w:r>
+        <w:t xml:space="preserve"> and execute the update</w:t>
+      </w:r>
+      <w:r>
+        <w:t xml:space="preserve"> into the database of the quantity (pending to add another topic so it will restore quantity for failing </w:t>
+      </w:r>
+      <w:r>
+        <w:t xml:space="preserve">orders), it will then send the result as inventoryresultevent into the </w:t>
+      </w:r>
+      <w:r>
+        <w:t>inventory-result-topic</w:t>
+      </w:r>
+      <w:r>
+        <w:t>, added a consumer in orders</w:t>
+      </w:r>
+      <w:r>
+        <w:t xml:space="preserve"> listening to this topic and execute the update of the order to CONFIRMED or CANCELLED</w:t>
+      </w:r>
+      <w:r>
+        <w:t>, here I could modify it to a function, send it to another queue for inventory to update if CANCELLED</w:t>
+      </w:r>
+    </w:p>
+    <w:p/>
+    <w:p>
+      <w:pPr>
+        <w:pStyle w:val="ListParagraph"/>
+        <w:numPr>
+          <w:ilvl w:val="0"/>
+          <w:numId w:val="4"/>
+        </w:numPr>
+      </w:pPr>
+      <w:r>
+        <w:t>Add distributed tracing</w:t>
+      </w:r>
+    </w:p>
+    <w:p>
+      <w:pPr>
+        <w:pStyle w:val="ListParagraph"/>
+      </w:pPr>
+      <w:r>
+        <w:t xml:space="preserve">We tried to add distributed tracing using </w:t>
+      </w:r>
+      <w:r>
+        <w:t xml:space="preserve">Grafana tempo, Grafana loki and Grafana, version incompatibilities failed to send spans </w:t>
+      </w:r>
+      <w:r>
+        <w:t xml:space="preserve">to the requests so it didn’t work that part. ran docker containers for the 3 grafana services, it required properties </w:t>
+      </w:r>
+      <w:r>
+        <w:t xml:space="preserve">added into docker for tempo and loki to be able to connect and have permissions. Then in Grafana localhost 3000 added as data sources </w:t>
+      </w:r>
+      <w:r>
+        <w:t xml:space="preserve">loki port 3100 and tempo port 3200, it was </w:t>
+      </w:r>
+      <w:hyperlink r:id="rId72" w:history="1">
+        <w:r>
+          <w:rPr>
+            <w:rStyle w:val="Hyperlink"/>
+          </w:rPr>
+          <w:t>http://loki:3100</w:t>
+        </w:r>
+      </w:hyperlink>
+      <w:r>
+        <w:t>, localhost didn’t work since it is inside docker</w:t>
+      </w:r>
+      <w:r>
+        <w:t xml:space="preserve"> and didn’t recognize it. Then added a derived </w:t>
+      </w:r>
+      <w:r>
+        <w:t>field in locke for the trace_id to link it with tempo.</w:t>
+      </w:r>
+    </w:p>
+    <w:p>
+      <w:pPr>
+        <w:pStyle w:val="ListParagraph"/>
+      </w:pPr>
+      <w:r>
+        <w:t>Added dependencies and properties (not working for spring boot 4 yet)</w:t>
+      </w:r>
+      <w:r>
+        <w:t>. Needs the streambr</w:t>
+      </w:r>
+      <w:r>
+        <w:t>idge to not used withPayload and instead just send the entity and leave spring configure it, it needs the headers added which is what keeps the trace id across ms</w:t>
+      </w:r>
+    </w:p>
+    <w:p/>
+    <w:p>
+      <w:pPr>
+        <w:pStyle w:val="ListParagraph"/>
+        <w:numPr>
+          <w:ilvl w:val="0"/>
+          <w:numId w:val="4"/>
+        </w:numPr>
+      </w:pPr>
+      <w:r>
+        <w:t>Added JWT token with oauth authentication</w:t>
+      </w:r>
+    </w:p>
+    <w:p>
+      <w:pPr>
+        <w:pStyle w:val="ListParagraph"/>
+      </w:pPr>
+      <w:r>
+        <w:t xml:space="preserve">For this case added an endpoint in the gateway for the login, </w:t>
+      </w:r>
+      <w:r>
+        <w:t>with url permitted in the security filter, this will return the jwt token generated with the secret key.</w:t>
+      </w:r>
+    </w:p>
+    <w:p>
+      <w:pPr>
+        <w:pStyle w:val="ListParagraph"/>
+      </w:pPr>
+      <w:r>
+        <w:lastRenderedPageBreak/>
+        <w:t>Added dependencies</w:t>
+      </w:r>
+      <w:r>
+        <w:t>, and a Jwt util bean which generates the jwt token based on a secret key and also a validates method</w:t>
+      </w:r>
+      <w:r>
+        <w:t xml:space="preserve"> which also uses the secret to validate</w:t>
+      </w:r>
+      <w:r>
+        <w:t xml:space="preserve">. Then need to send the authorization bearer with that token on the requests, since the microservices also have the secret </w:t>
+      </w:r>
+      <w:r>
+        <w:t>they can validate the jwt token</w:t>
+      </w:r>
+      <w:r>
+        <w:t xml:space="preserve"> to allow </w:t>
+      </w:r>
+      <w:r>
+        <w:t>the resource</w:t>
+      </w:r>
+    </w:p>
+    <w:p/>
+    <w:p>
       <w:r>
         <w:tab/>
       </w:r>
       <w:r>
         <w:t>-bulkhead pattern</w:t>
+      </w:r>
+    </w:p>
+    <w:p>
+      <w:r>
+        <w:tab/>
+        <w:t>-kafka security layer</w:t>
       </w:r>
     </w:p>
     <w:p>
@@ -11708,6 +12044,7 @@
   <w:style w:type="character" w:default="1" w:styleId="DefaultParagraphFont">
     <w:name w:val="Default Paragraph Font"/>
     <w:uiPriority w:val="1"/>
+    <w:semiHidden/>
     <w:unhideWhenUsed/>
   </w:style>
   <w:style w:type="table" w:default="1" w:styleId="TableNormal">

</xml_diff>